<commit_message>
linked requirements to interviews
</commit_message>
<xml_diff>
--- a/Analysis/list of requirements.docx
+++ b/Analysis/list of requirements.docx
@@ -26,10 +26,57 @@
         <w:rPr>
           <w:b/>
           <w:bCs/>
-          <w:sz w:val="28"/>
-          <w:szCs w:val="28"/>
-        </w:rPr>
-      </w:pPr>
+          <w:sz w:val="20"/>
+          <w:szCs w:val="20"/>
+        </w:rPr>
+      </w:pPr>
+      <w:r>
+        <w:rPr>
+          <w:b/>
+          <w:bCs/>
+          <w:sz w:val="20"/>
+          <w:szCs w:val="20"/>
+          <w:u w:val="single"/>
+        </w:rPr>
+        <w:t>I</w:t>
+      </w:r>
+      <w:r>
+        <w:rPr>
+          <w:b/>
+          <w:bCs/>
+          <w:sz w:val="20"/>
+          <w:szCs w:val="20"/>
+        </w:rPr>
+        <w:t xml:space="preserve"> = Interview</w:t>
+      </w:r>
+      <w:r>
+        <w:rPr>
+          <w:b/>
+          <w:bCs/>
+          <w:sz w:val="20"/>
+          <w:szCs w:val="20"/>
+        </w:rPr>
+        <w:tab/>
+      </w:r>
+      <w:r>
+        <w:rPr>
+          <w:b/>
+          <w:bCs/>
+          <w:sz w:val="20"/>
+          <w:szCs w:val="20"/>
+          <w:u w:val="single"/>
+        </w:rPr>
+        <w:t>PS</w:t>
+      </w:r>
+      <w:r>
+        <w:rPr>
+          <w:b/>
+          <w:bCs/>
+          <w:sz w:val="20"/>
+          <w:szCs w:val="20"/>
+        </w:rPr>
+        <w:t xml:space="preserve"> = Previous Solution</w:t>
+      </w:r>
     </w:p>
     <w:p>
       <w:pPr>
@@ -99,6 +146,17 @@
       <w:r>
         <w:t>Allow the user to upload multiple Rocket League replays</w:t>
       </w:r>
+      <w:r>
+        <w:t xml:space="preserve"> </w:t>
+      </w:r>
+      <w:r>
+        <w:rPr>
+          <w:b/>
+          <w:bCs/>
+          <w:u w:val="single"/>
+        </w:rPr>
+        <w:t>I3</w:t>
+      </w:r>
     </w:p>
     <w:p>
       <w:pPr>
@@ -112,7 +170,7 @@
         <w:t>Only allow Rocket League .replay files to be uploade</w:t>
       </w:r>
       <w:r>
-        <w:t>d, displaying appropriate error message for invalid upload attempt</w:t>
+        <w:t>d</w:t>
       </w:r>
     </w:p>
     <w:p>
@@ -124,7 +182,7 @@
         </w:numPr>
       </w:pPr>
       <w:r>
-        <w:t>Parse replay files using Carball</w:t>
+        <w:t>Display appropriate error message for invalid upload attempt</w:t>
       </w:r>
     </w:p>
     <w:p>
@@ -136,10 +194,7 @@
         </w:numPr>
       </w:pPr>
       <w:r>
-        <w:t xml:space="preserve">(optional) </w:t>
-      </w:r>
-      <w:r>
-        <w:t>Automatically gather replays from Ballchasing.com using its API given user provides their username and date range</w:t>
+        <w:t>Parse replay files using Carball</w:t>
       </w:r>
     </w:p>
     <w:p>
@@ -151,6 +206,32 @@
         </w:numPr>
       </w:pPr>
       <w:r>
+        <w:t xml:space="preserve">(optional) </w:t>
+      </w:r>
+      <w:r>
+        <w:t>Automatically gather replays from Ballchasing.com using its API given user provides their username and date range</w:t>
+      </w:r>
+      <w:r>
+        <w:t xml:space="preserve"> </w:t>
+      </w:r>
+      <w:r>
+        <w:rPr>
+          <w:b/>
+          <w:bCs/>
+          <w:u w:val="single"/>
+        </w:rPr>
+        <w:t>I3</w:t>
+      </w:r>
+    </w:p>
+    <w:p>
+      <w:pPr>
+        <w:pStyle w:val="ListParagraph"/>
+        <w:numPr>
+          <w:ilvl w:val="0"/>
+          <w:numId w:val="3"/>
+        </w:numPr>
+      </w:pPr>
+      <w:r>
         <w:t>Require user to choose their rank</w:t>
       </w:r>
       <w:r>
@@ -170,6 +251,13 @@
           <w:bCs/>
         </w:rPr>
         <w:t>1.2 Data Overview</w:t>
+      </w:r>
+      <w:r>
+        <w:rPr>
+          <w:b/>
+          <w:bCs/>
+        </w:rPr>
+        <w:t xml:space="preserve"> (feature derived from I1 I2)</w:t>
       </w:r>
     </w:p>
     <w:p>
@@ -191,7 +279,7 @@
         <w:t>core gameplay</w:t>
       </w:r>
       <w:r>
-        <w:t xml:space="preserve"> statistics such as: (using similar charts to Ballchasing.com) </w:t>
+        <w:t xml:space="preserve"> statistics such as: </w:t>
       </w:r>
     </w:p>
     <w:p>
@@ -209,6 +297,17 @@
       <w:r>
         <w:t>Average boost amount</w:t>
       </w:r>
+      <w:r>
+        <w:t xml:space="preserve"> </w:t>
+      </w:r>
+      <w:r>
+        <w:rPr>
+          <w:b/>
+          <w:bCs/>
+          <w:u w:val="single"/>
+        </w:rPr>
+        <w:t>I1</w:t>
+      </w:r>
     </w:p>
     <w:p>
       <w:pPr>
@@ -225,6 +324,25 @@
       <w:r>
         <w:t>Small boost pads collected</w:t>
       </w:r>
+      <w:r>
+        <w:t xml:space="preserve"> </w:t>
+      </w:r>
+      <w:r>
+        <w:rPr>
+          <w:b/>
+          <w:bCs/>
+          <w:u w:val="single"/>
+        </w:rPr>
+        <w:t>I</w:t>
+      </w:r>
+      <w:r>
+        <w:rPr>
+          <w:b/>
+          <w:bCs/>
+          <w:u w:val="single"/>
+        </w:rPr>
+        <w:t>1</w:t>
+      </w:r>
     </w:p>
     <w:p>
       <w:pPr>
@@ -241,6 +359,25 @@
       <w:r>
         <w:t>Boost wasted (used while going max speed)</w:t>
       </w:r>
+      <w:r>
+        <w:t xml:space="preserve"> </w:t>
+      </w:r>
+      <w:r>
+        <w:rPr>
+          <w:b/>
+          <w:bCs/>
+          <w:u w:val="single"/>
+        </w:rPr>
+        <w:t>I</w:t>
+      </w:r>
+      <w:r>
+        <w:rPr>
+          <w:b/>
+          <w:bCs/>
+          <w:u w:val="single"/>
+        </w:rPr>
+        <w:t>1</w:t>
+      </w:r>
     </w:p>
     <w:p>
       <w:pPr>
@@ -257,6 +394,25 @@
       <w:r>
         <w:t>Time spent on different boost ranges</w:t>
       </w:r>
+      <w:r>
+        <w:t xml:space="preserve"> </w:t>
+      </w:r>
+      <w:r>
+        <w:rPr>
+          <w:b/>
+          <w:bCs/>
+          <w:u w:val="single"/>
+        </w:rPr>
+        <w:t>I</w:t>
+      </w:r>
+      <w:r>
+        <w:rPr>
+          <w:b/>
+          <w:bCs/>
+          <w:u w:val="single"/>
+        </w:rPr>
+        <w:t>1</w:t>
+      </w:r>
     </w:p>
     <w:p>
       <w:pPr>
@@ -321,6 +477,17 @@
       <w:r>
         <w:t>(optional) Possession (comparing user’s team to opposing team)</w:t>
       </w:r>
+      <w:r>
+        <w:t xml:space="preserve"> </w:t>
+      </w:r>
+      <w:r>
+        <w:rPr>
+          <w:b/>
+          <w:bCs/>
+          <w:u w:val="single"/>
+        </w:rPr>
+        <w:t>I1</w:t>
+      </w:r>
     </w:p>
     <w:p>
       <w:pPr>
@@ -337,6 +504,17 @@
       <w:r>
         <w:t>Visualise the AVERAGE of the statistics across the replays</w:t>
       </w:r>
+      <w:r>
+        <w:t xml:space="preserve"> using bar charts </w:t>
+      </w:r>
+      <w:r>
+        <w:rPr>
+          <w:b/>
+          <w:bCs/>
+          <w:u w:val="single"/>
+        </w:rPr>
+        <w:t>PS1</w:t>
+      </w:r>
     </w:p>
     <w:p>
       <w:pPr>
@@ -369,6 +547,17 @@
       <w:r>
         <w:t>(optional) Allow users to upload 2 batches of replays to compare directly to each other</w:t>
       </w:r>
+      <w:r>
+        <w:t xml:space="preserve"> </w:t>
+      </w:r>
+      <w:r>
+        <w:rPr>
+          <w:b/>
+          <w:bCs/>
+          <w:u w:val="single"/>
+        </w:rPr>
+        <w:t>I3</w:t>
+      </w:r>
     </w:p>
     <w:p>
       <w:pPr>
@@ -385,6 +574,17 @@
       <w:r>
         <w:t>Allow the user to filter which data category is displayed</w:t>
       </w:r>
+      <w:r>
+        <w:t xml:space="preserve"> </w:t>
+      </w:r>
+      <w:r>
+        <w:rPr>
+          <w:b/>
+          <w:bCs/>
+          <w:u w:val="single"/>
+        </w:rPr>
+        <w:t>PS1</w:t>
+      </w:r>
     </w:p>
     <w:p>
       <w:pPr>
@@ -424,6 +624,17 @@
       <w:r>
         <w:t>Striker</w:t>
       </w:r>
+      <w:r>
+        <w:t xml:space="preserve"> </w:t>
+      </w:r>
+      <w:r>
+        <w:rPr>
+          <w:b/>
+          <w:bCs/>
+          <w:u w:val="single"/>
+        </w:rPr>
+        <w:t>I3</w:t>
+      </w:r>
     </w:p>
     <w:p>
       <w:pPr>
@@ -436,6 +647,17 @@
       <w:r>
         <w:t>Enforcer</w:t>
       </w:r>
+      <w:r>
+        <w:t xml:space="preserve"> </w:t>
+      </w:r>
+      <w:r>
+        <w:rPr>
+          <w:b/>
+          <w:bCs/>
+          <w:u w:val="single"/>
+        </w:rPr>
+        <w:t>I2 I3</w:t>
+      </w:r>
     </w:p>
     <w:p>
       <w:pPr>
@@ -448,6 +670,17 @@
       <w:r>
         <w:t>Freestyler</w:t>
       </w:r>
+      <w:r>
+        <w:t xml:space="preserve"> </w:t>
+      </w:r>
+      <w:r>
+        <w:rPr>
+          <w:b/>
+          <w:bCs/>
+          <w:u w:val="single"/>
+        </w:rPr>
+        <w:t>I1 I2 I3</w:t>
+      </w:r>
     </w:p>
     <w:p>
       <w:pPr>
@@ -460,6 +693,25 @@
       <w:r>
         <w:t>Dribbler</w:t>
       </w:r>
+      <w:r>
+        <w:t xml:space="preserve"> </w:t>
+      </w:r>
+      <w:r>
+        <w:rPr>
+          <w:b/>
+          <w:bCs/>
+          <w:u w:val="single"/>
+        </w:rPr>
+        <w:t>I3</w:t>
+      </w:r>
+      <w:r>
+        <w:rPr>
+          <w:b/>
+          <w:bCs/>
+          <w:u w:val="single"/>
+        </w:rPr>
+        <w:t xml:space="preserve"> I4</w:t>
+      </w:r>
     </w:p>
     <w:p>
       <w:pPr>
@@ -472,6 +724,25 @@
       <w:r>
         <w:t>Ball chaser</w:t>
       </w:r>
+      <w:r>
+        <w:t xml:space="preserve"> </w:t>
+      </w:r>
+      <w:r>
+        <w:rPr>
+          <w:b/>
+          <w:bCs/>
+          <w:u w:val="single"/>
+        </w:rPr>
+        <w:t>I2 I3</w:t>
+      </w:r>
+      <w:r>
+        <w:rPr>
+          <w:b/>
+          <w:bCs/>
+          <w:u w:val="single"/>
+        </w:rPr>
+        <w:t xml:space="preserve"> I4</w:t>
+      </w:r>
     </w:p>
     <w:p>
       <w:pPr>
@@ -484,6 +755,17 @@
       <w:r>
         <w:t>Passive player</w:t>
       </w:r>
+      <w:r>
+        <w:t xml:space="preserve"> </w:t>
+      </w:r>
+      <w:r>
+        <w:rPr>
+          <w:b/>
+          <w:bCs/>
+          <w:u w:val="single"/>
+        </w:rPr>
+        <w:t>I1</w:t>
+      </w:r>
     </w:p>
     <w:p>
       <w:pPr>
@@ -496,6 +778,25 @@
       <w:r>
         <w:t>Playmaker</w:t>
       </w:r>
+      <w:r>
+        <w:t xml:space="preserve"> </w:t>
+      </w:r>
+      <w:r>
+        <w:rPr>
+          <w:b/>
+          <w:bCs/>
+          <w:u w:val="single"/>
+        </w:rPr>
+        <w:t>I</w:t>
+      </w:r>
+      <w:r>
+        <w:rPr>
+          <w:b/>
+          <w:bCs/>
+          <w:u w:val="single"/>
+        </w:rPr>
+        <w:t>3</w:t>
+      </w:r>
     </w:p>
     <w:p>
       <w:pPr>
@@ -520,6 +821,17 @@
       <w:r>
         <w:t>Demolition/bump amount</w:t>
       </w:r>
+      <w:r>
+        <w:t xml:space="preserve"> </w:t>
+      </w:r>
+      <w:r>
+        <w:rPr>
+          <w:b/>
+          <w:bCs/>
+          <w:u w:val="single"/>
+        </w:rPr>
+        <w:t>I2 I3</w:t>
+      </w:r>
     </w:p>
     <w:p>
       <w:pPr>
@@ -532,6 +844,17 @@
       <w:r>
         <w:t>Time spent ahead of the ball</w:t>
       </w:r>
+      <w:r>
+        <w:t xml:space="preserve"> </w:t>
+      </w:r>
+      <w:r>
+        <w:rPr>
+          <w:b/>
+          <w:bCs/>
+          <w:u w:val="single"/>
+        </w:rPr>
+        <w:t>I1 I3</w:t>
+      </w:r>
     </w:p>
     <w:p>
       <w:pPr>
@@ -544,6 +867,17 @@
       <w:r>
         <w:t>Time spent high in the air</w:t>
       </w:r>
+      <w:r>
+        <w:t xml:space="preserve"> </w:t>
+      </w:r>
+      <w:r>
+        <w:rPr>
+          <w:b/>
+          <w:bCs/>
+          <w:u w:val="single"/>
+        </w:rPr>
+        <w:t>I1 I3</w:t>
+      </w:r>
     </w:p>
     <w:p>
       <w:pPr>
@@ -568,6 +902,17 @@
       <w:r>
         <w:t>Time spent low to the ground</w:t>
       </w:r>
+      <w:r>
+        <w:t xml:space="preserve"> </w:t>
+      </w:r>
+      <w:r>
+        <w:rPr>
+          <w:b/>
+          <w:bCs/>
+          <w:u w:val="single"/>
+        </w:rPr>
+        <w:t>I3</w:t>
+      </w:r>
     </w:p>
     <w:p>
       <w:pPr>
@@ -594,11 +939,32 @@
       <w:pPr>
         <w:pStyle w:val="ListParagraph"/>
         <w:numPr>
+          <w:ilvl w:val="1"/>
+          <w:numId w:val="5"/>
+        </w:numPr>
+      </w:pPr>
+      <w:r>
+        <w:t xml:space="preserve">Distance to ball </w:t>
+      </w:r>
+      <w:r>
+        <w:rPr>
+          <w:b/>
+          <w:bCs/>
+          <w:u w:val="single"/>
+        </w:rPr>
+        <w:t>I3</w:t>
+      </w:r>
+    </w:p>
+    <w:p>
+      <w:pPr>
+        <w:pStyle w:val="ListParagraph"/>
+        <w:numPr>
           <w:ilvl w:val="0"/>
           <w:numId w:val="5"/>
         </w:numPr>
       </w:pPr>
       <w:r>
+        <w:lastRenderedPageBreak/>
         <w:t>Use manually labelled training data to train the model</w:t>
       </w:r>
     </w:p>
@@ -611,7 +977,6 @@
         </w:numPr>
       </w:pPr>
       <w:r>
-        <w:lastRenderedPageBreak/>
         <w:t>Only use the training data similar to user’s rank</w:t>
       </w:r>
     </w:p>
@@ -644,6 +1009,12 @@
       <w:r>
         <w:t>for improvement based on identified playstyle</w:t>
       </w:r>
+      <w:r>
+        <w:t xml:space="preserve"> using suggestions from </w:t>
+      </w:r>
+      <w:r>
+        <w:t>interviews</w:t>
+      </w:r>
     </w:p>
     <w:p>
       <w:pPr>
@@ -671,6 +1042,17 @@
       <w:r>
         <w:t>Compare user’s average statistics to average values similar to user’s rank (same rank, one above)</w:t>
       </w:r>
+      <w:r>
+        <w:t xml:space="preserve"> </w:t>
+      </w:r>
+      <w:r>
+        <w:rPr>
+          <w:b/>
+          <w:bCs/>
+          <w:u w:val="single"/>
+        </w:rPr>
+        <w:t>I3</w:t>
+      </w:r>
     </w:p>
     <w:p>
       <w:pPr>
@@ -698,6 +1080,17 @@
       <w:r>
         <w:t>Visualise this with spider charts</w:t>
       </w:r>
+      <w:r>
+        <w:t xml:space="preserve"> </w:t>
+      </w:r>
+      <w:r>
+        <w:rPr>
+          <w:b/>
+          <w:bCs/>
+          <w:u w:val="single"/>
+        </w:rPr>
+        <w:t>I3</w:t>
+      </w:r>
     </w:p>
     <w:p>
       <w:pPr>
@@ -779,13 +1172,7 @@
         <w:t xml:space="preserve">Backend built with </w:t>
       </w:r>
       <w:r>
-        <w:t>FastAPI in Python</w:t>
-      </w:r>
-      <w:r>
-        <w:t xml:space="preserve"> </w:t>
-      </w:r>
-      <w:r>
-        <w:t xml:space="preserve"> to handle </w:t>
+        <w:t xml:space="preserve">FastAPI in Python to handle </w:t>
       </w:r>
       <w:r>
         <w:t xml:space="preserve">machine learning, data analysis, </w:t>
@@ -955,6 +1342,17 @@
       <w:r>
         <w:t xml:space="preserve"> (average below 1 seconds per replay uploaded)</w:t>
       </w:r>
+      <w:r>
+        <w:t xml:space="preserve"> </w:t>
+      </w:r>
+      <w:r>
+        <w:rPr>
+          <w:b/>
+          <w:bCs/>
+          <w:u w:val="single"/>
+        </w:rPr>
+        <w:t>I3</w:t>
+      </w:r>
     </w:p>
     <w:p>
       <w:pPr>
@@ -1031,6 +1429,7 @@
         </w:numPr>
       </w:pPr>
       <w:r>
+        <w:lastRenderedPageBreak/>
         <w:t>Use recent data to make</w:t>
       </w:r>
       <w:r>
@@ -1058,7 +1457,6 @@
           <w:b/>
           <w:bCs/>
         </w:rPr>
-        <w:lastRenderedPageBreak/>
         <w:t>2.4 Reliability</w:t>
       </w:r>
     </w:p>

</xml_diff>

<commit_message>
added previous solution research
</commit_message>
<xml_diff>
--- a/Analysis/list of requirements.docx
+++ b/Analysis/list of requirements.docx
@@ -515,6 +515,14 @@
         </w:rPr>
         <w:t>PS1</w:t>
       </w:r>
+      <w:r>
+        <w:rPr>
+          <w:b/>
+          <w:bCs/>
+          <w:u w:val="single"/>
+        </w:rPr>
+        <w:t>.2</w:t>
+      </w:r>
     </w:p>
     <w:p>
       <w:pPr>
@@ -545,6 +553,30 @@
         </w:rPr>
       </w:pPr>
       <w:r>
+        <w:t xml:space="preserve">Provide a section that compares certain statistics with games that were won and lost </w:t>
+      </w:r>
+      <w:r>
+        <w:rPr>
+          <w:b/>
+          <w:bCs/>
+          <w:u w:val="single"/>
+        </w:rPr>
+        <w:t>PS2.1</w:t>
+      </w:r>
+    </w:p>
+    <w:p>
+      <w:pPr>
+        <w:pStyle w:val="ListParagraph"/>
+        <w:numPr>
+          <w:ilvl w:val="0"/>
+          <w:numId w:val="4"/>
+        </w:numPr>
+        <w:rPr>
+          <w:b/>
+          <w:bCs/>
+        </w:rPr>
+      </w:pPr>
+      <w:r>
         <w:t>(optional) Allow users to upload 2 batches of replays to compare directly to each other</w:t>
       </w:r>
       <w:r>
@@ -584,6 +616,14 @@
           <w:u w:val="single"/>
         </w:rPr>
         <w:t>PS1</w:t>
+      </w:r>
+      <w:r>
+        <w:rPr>
+          <w:b/>
+          <w:bCs/>
+          <w:u w:val="single"/>
+        </w:rPr>
+        <w:t>.1</w:t>
       </w:r>
     </w:p>
     <w:p>
@@ -944,6 +984,7 @@
         </w:numPr>
       </w:pPr>
       <w:r>
+        <w:lastRenderedPageBreak/>
         <w:t xml:space="preserve">Distance to ball </w:t>
       </w:r>
       <w:r>
@@ -964,8 +1005,18 @@
         </w:numPr>
       </w:pPr>
       <w:r>
-        <w:lastRenderedPageBreak/>
         <w:t>Use manually labelled training data to train the model</w:t>
+      </w:r>
+      <w:r>
+        <w:t xml:space="preserve"> </w:t>
+      </w:r>
+      <w:r>
+        <w:rPr>
+          <w:b/>
+          <w:bCs/>
+          <w:u w:val="single"/>
+        </w:rPr>
+        <w:t>I1 I2 I3 I4</w:t>
       </w:r>
     </w:p>
     <w:p>
@@ -1246,6 +1297,17 @@
       <w:r>
         <w:t xml:space="preserve"> data to be displayed at any one time, not all at once</w:t>
       </w:r>
+      <w:r>
+        <w:t xml:space="preserve"> </w:t>
+      </w:r>
+      <w:r>
+        <w:rPr>
+          <w:b/>
+          <w:bCs/>
+          <w:u w:val="single"/>
+        </w:rPr>
+        <w:t>PS1.1</w:t>
+      </w:r>
     </w:p>
     <w:p>
       <w:pPr>
@@ -1258,6 +1320,25 @@
       <w:r>
         <w:t>Colours in charts consistent</w:t>
       </w:r>
+      <w:r>
+        <w:t xml:space="preserve"> </w:t>
+      </w:r>
+      <w:r>
+        <w:rPr>
+          <w:b/>
+          <w:bCs/>
+          <w:u w:val="single"/>
+        </w:rPr>
+        <w:t>PS1.2</w:t>
+      </w:r>
+      <w:r>
+        <w:rPr>
+          <w:b/>
+          <w:bCs/>
+          <w:u w:val="single"/>
+        </w:rPr>
+        <w:t xml:space="preserve"> PS2.1</w:t>
+      </w:r>
     </w:p>
     <w:p>
       <w:pPr>
@@ -1268,8 +1349,50 @@
         </w:numPr>
       </w:pPr>
       <w:r>
+        <w:t xml:space="preserve">Colours in charts contrasting for intuitiveness and accessibility </w:t>
+      </w:r>
+      <w:r>
+        <w:rPr>
+          <w:b/>
+          <w:bCs/>
+          <w:u w:val="single"/>
+        </w:rPr>
+        <w:t>PS2.1</w:t>
+      </w:r>
+      <w:r>
+        <w:t xml:space="preserve"> </w:t>
+      </w:r>
+    </w:p>
+    <w:p>
+      <w:pPr>
+        <w:pStyle w:val="ListParagraph"/>
+        <w:numPr>
+          <w:ilvl w:val="0"/>
+          <w:numId w:val="8"/>
+        </w:numPr>
+      </w:pPr>
+      <w:r>
         <w:t>Charts labelled clearly</w:t>
       </w:r>
+      <w:r>
+        <w:t xml:space="preserve"> </w:t>
+      </w:r>
+      <w:r>
+        <w:rPr>
+          <w:b/>
+          <w:bCs/>
+          <w:u w:val="single"/>
+        </w:rPr>
+        <w:t>PS1.2</w:t>
+      </w:r>
+      <w:r>
+        <w:rPr>
+          <w:b/>
+          <w:bCs/>
+          <w:u w:val="single"/>
+        </w:rPr>
+        <w:t xml:space="preserve"> PS2.1</w:t>
+      </w:r>
     </w:p>
     <w:p>
       <w:pPr>
@@ -1365,6 +1488,17 @@
       <w:r>
         <w:t>Provide loading visualisation (optional: with progress)</w:t>
       </w:r>
+      <w:r>
+        <w:t xml:space="preserve"> </w:t>
+      </w:r>
+      <w:r>
+        <w:rPr>
+          <w:b/>
+          <w:bCs/>
+          <w:u w:val="single"/>
+        </w:rPr>
+        <w:t>PS2.2</w:t>
+      </w:r>
     </w:p>
     <w:p>
       <w:pPr>
@@ -1414,6 +1548,7 @@
         </w:numPr>
       </w:pPr>
       <w:r>
+        <w:lastRenderedPageBreak/>
         <w:t>Playstyle model will be tested with testing data, requiring sufficiently high accuracy</w:t>
       </w:r>
       <w:r>
@@ -1429,7 +1564,6 @@
         </w:numPr>
       </w:pPr>
       <w:r>
-        <w:lastRenderedPageBreak/>
         <w:t>Use recent data to make</w:t>
       </w:r>
       <w:r>
@@ -1443,6 +1577,17 @@
       </w:r>
       <w:r>
         <w:t xml:space="preserve"> dataset to ensure comparison is accurate to today’s standards of different ranks</w:t>
+      </w:r>
+      <w:r>
+        <w:t xml:space="preserve"> </w:t>
+      </w:r>
+      <w:r>
+        <w:rPr>
+          <w:b/>
+          <w:bCs/>
+          <w:u w:val="single"/>
+        </w:rPr>
+        <w:t>PS2.3</w:t>
       </w:r>
     </w:p>
     <w:p>

</xml_diff>

<commit_message>
Design Plan + analysis touches
</commit_message>
<xml_diff>
--- a/Analysis/list of requirements.docx
+++ b/Analysis/list of requirements.docx
@@ -162,15 +162,65 @@
       <w:pPr>
         <w:pStyle w:val="ListParagraph"/>
         <w:numPr>
-          <w:ilvl w:val="0"/>
+          <w:ilvl w:val="1"/>
           <w:numId w:val="3"/>
         </w:numPr>
       </w:pPr>
       <w:r>
-        <w:t>Only allow Rocket League .replay files to be uploade</w:t>
+        <w:t>Allow the user to upload 1 replay at a time</w:t>
+      </w:r>
+    </w:p>
+    <w:p>
+      <w:pPr>
+        <w:pStyle w:val="ListParagraph"/>
+        <w:numPr>
+          <w:ilvl w:val="1"/>
+          <w:numId w:val="3"/>
+        </w:numPr>
+      </w:pPr>
+      <w:r>
+        <w:t>Allow the user to upload a folder of replays</w:t>
+      </w:r>
+    </w:p>
+    <w:p>
+      <w:pPr>
+        <w:pStyle w:val="ListParagraph"/>
+        <w:numPr>
+          <w:ilvl w:val="0"/>
+          <w:numId w:val="3"/>
+        </w:numPr>
+      </w:pPr>
+      <w:r>
+        <w:t>Only allow Rocket League .replay files</w:t>
+      </w:r>
+      <w:r>
+        <w:t xml:space="preserve"> or folder of them</w:t>
+      </w:r>
+      <w:r>
+        <w:t xml:space="preserve"> to be uploade</w:t>
       </w:r>
       <w:r>
         <w:t>d</w:t>
+      </w:r>
+    </w:p>
+    <w:p>
+      <w:pPr>
+        <w:pStyle w:val="ListParagraph"/>
+        <w:numPr>
+          <w:ilvl w:val="0"/>
+          <w:numId w:val="3"/>
+        </w:numPr>
+      </w:pPr>
+      <w:r>
+        <w:t xml:space="preserve">Show names of the replays that the user uploaded so they can check they are correct </w:t>
+      </w:r>
+      <w:r>
+        <w:rPr>
+          <w:b/>
+          <w:bCs/>
+          <w:u w:val="single"/>
+        </w:rPr>
+        <w:t>PS3.1</w:t>
       </w:r>
     </w:p>
     <w:p>
@@ -333,15 +383,7 @@
           <w:bCs/>
           <w:u w:val="single"/>
         </w:rPr>
-        <w:t>I</w:t>
-      </w:r>
-      <w:r>
-        <w:rPr>
-          <w:b/>
-          <w:bCs/>
-          <w:u w:val="single"/>
-        </w:rPr>
-        <w:t>1</w:t>
+        <w:t>I1</w:t>
       </w:r>
     </w:p>
     <w:p>
@@ -368,15 +410,7 @@
           <w:bCs/>
           <w:u w:val="single"/>
         </w:rPr>
-        <w:t>I</w:t>
-      </w:r>
-      <w:r>
-        <w:rPr>
-          <w:b/>
-          <w:bCs/>
-          <w:u w:val="single"/>
-        </w:rPr>
-        <w:t>1</w:t>
+        <w:t>I1</w:t>
       </w:r>
     </w:p>
     <w:p>
@@ -403,15 +437,7 @@
           <w:bCs/>
           <w:u w:val="single"/>
         </w:rPr>
-        <w:t>I</w:t>
-      </w:r>
-      <w:r>
-        <w:rPr>
-          <w:b/>
-          <w:bCs/>
-          <w:u w:val="single"/>
-        </w:rPr>
-        <w:t>1</w:t>
+        <w:t>I1</w:t>
       </w:r>
     </w:p>
     <w:p>
@@ -928,6 +954,7 @@
         </w:numPr>
       </w:pPr>
       <w:r>
+        <w:lastRenderedPageBreak/>
         <w:t>Shot to goal ratio</w:t>
       </w:r>
     </w:p>
@@ -984,7 +1011,6 @@
         </w:numPr>
       </w:pPr>
       <w:r>
-        <w:lastRenderedPageBreak/>
         <w:t xml:space="preserve">Distance to ball </w:t>
       </w:r>
       <w:r>
@@ -1318,6 +1344,30 @@
         </w:numPr>
       </w:pPr>
       <w:r>
+        <w:t xml:space="preserve">Only display one section at a time (Replay upload, Data Overview, Playstyle Classification, Data Comparison) </w:t>
+      </w:r>
+    </w:p>
+    <w:p>
+      <w:pPr>
+        <w:pStyle w:val="ListParagraph"/>
+        <w:numPr>
+          <w:ilvl w:val="0"/>
+          <w:numId w:val="8"/>
+        </w:numPr>
+      </w:pPr>
+      <w:r>
+        <w:t>Clearly distinguish between each section</w:t>
+      </w:r>
+    </w:p>
+    <w:p>
+      <w:pPr>
+        <w:pStyle w:val="ListParagraph"/>
+        <w:numPr>
+          <w:ilvl w:val="0"/>
+          <w:numId w:val="8"/>
+        </w:numPr>
+      </w:pPr>
+      <w:r>
         <w:t>Colours in charts consistent</w:t>
       </w:r>
       <w:r>
@@ -1509,6 +1559,7 @@
         </w:numPr>
       </w:pPr>
       <w:r>
+        <w:lastRenderedPageBreak/>
         <w:t>When comparing data, use data from the large dataset instead of using Ballchasing API for quicker loading speed</w:t>
       </w:r>
     </w:p>
@@ -1548,7 +1599,6 @@
         </w:numPr>
       </w:pPr>
       <w:r>
-        <w:lastRenderedPageBreak/>
         <w:t>Playstyle model will be tested with testing data, requiring sufficiently high accuracy</w:t>
       </w:r>
       <w:r>
@@ -2239,7 +2289,7 @@
         <w:b/>
       </w:rPr>
     </w:lvl>
-    <w:lvl w:ilvl="1" w:tplc="08090019" w:tentative="1">
+    <w:lvl w:ilvl="1" w:tplc="08090019">
       <w:start w:val="1"/>
       <w:numFmt w:val="lowerLetter"/>
       <w:lvlText w:val="%2."/>

</xml_diff>

<commit_message>
made and justified user upload UI
</commit_message>
<xml_diff>
--- a/Analysis/list of requirements.docx
+++ b/Analysis/list of requirements.docx
@@ -194,13 +194,25 @@
         <w:t>Only allow Rocket League .replay files</w:t>
       </w:r>
       <w:r>
-        <w:t xml:space="preserve"> or folder of them</w:t>
-      </w:r>
-      <w:r>
-        <w:t xml:space="preserve"> to be uploade</w:t>
+        <w:t xml:space="preserve"> </w:t>
+      </w:r>
+      <w:r>
+        <w:t>to be uploade</w:t>
       </w:r>
       <w:r>
         <w:t>d</w:t>
+      </w:r>
+    </w:p>
+    <w:p>
+      <w:pPr>
+        <w:pStyle w:val="ListParagraph"/>
+        <w:numPr>
+          <w:ilvl w:val="0"/>
+          <w:numId w:val="3"/>
+        </w:numPr>
+      </w:pPr>
+      <w:r>
+        <w:t>Only allow 1 type of game mode across the replays before analysing (2v2, 3v3)</w:t>
       </w:r>
     </w:p>
     <w:p>
@@ -931,6 +943,7 @@
         </w:numPr>
       </w:pPr>
       <w:r>
+        <w:lastRenderedPageBreak/>
         <w:t>Time spent high in the air</w:t>
       </w:r>
       <w:r>
@@ -954,7 +967,6 @@
         </w:numPr>
       </w:pPr>
       <w:r>
-        <w:lastRenderedPageBreak/>
         <w:t>Shot to goal ratio</w:t>
       </w:r>
     </w:p>
@@ -1286,12 +1298,6 @@
       </w:r>
     </w:p>
     <w:p>
-      <w:pPr>
-        <w:rPr>
-          <w:b/>
-          <w:bCs/>
-        </w:rPr>
-      </w:pPr>
       <w:r>
         <w:rPr>
           <w:b/>
@@ -1368,6 +1374,18 @@
         </w:numPr>
       </w:pPr>
       <w:r>
+        <w:t>Colours of text chosen such that it contrasts with its background</w:t>
+      </w:r>
+    </w:p>
+    <w:p>
+      <w:pPr>
+        <w:pStyle w:val="ListParagraph"/>
+        <w:numPr>
+          <w:ilvl w:val="0"/>
+          <w:numId w:val="8"/>
+        </w:numPr>
+      </w:pPr>
+      <w:r>
         <w:t>Colours in charts consistent</w:t>
       </w:r>
       <w:r>
@@ -1536,6 +1554,7 @@
         </w:numPr>
       </w:pPr>
       <w:r>
+        <w:lastRenderedPageBreak/>
         <w:t>Provide loading visualisation (optional: with progress)</w:t>
       </w:r>
       <w:r>
@@ -1559,7 +1578,6 @@
         </w:numPr>
       </w:pPr>
       <w:r>
-        <w:lastRenderedPageBreak/>
         <w:t>When comparing data, use data from the large dataset instead of using Ballchasing API for quicker loading speed</w:t>
       </w:r>
     </w:p>

</xml_diff>

<commit_message>
data overview UI with justification
</commit_message>
<xml_diff>
--- a/Analysis/list of requirements.docx
+++ b/Analysis/list of requirements.docx
@@ -319,7 +319,22 @@
           <w:b/>
           <w:bCs/>
         </w:rPr>
-        <w:t xml:space="preserve"> (feature derived from I1 I2)</w:t>
+        <w:t xml:space="preserve"> (feature derived from </w:t>
+      </w:r>
+      <w:r>
+        <w:rPr>
+          <w:b/>
+          <w:bCs/>
+          <w:u w:val="single"/>
+        </w:rPr>
+        <w:t>I1 I2</w:t>
+      </w:r>
+      <w:r>
+        <w:rPr>
+          <w:b/>
+          <w:bCs/>
+        </w:rPr>
+        <w:t>)</w:t>
       </w:r>
     </w:p>
     <w:p>

</xml_diff>

<commit_message>
rank comparison UI + justification + supporting sketches
</commit_message>
<xml_diff>
--- a/Analysis/list of requirements.docx
+++ b/Analysis/list of requirements.docx
@@ -302,6 +302,26 @@
     </w:p>
     <w:p>
       <w:pPr>
+        <w:pStyle w:val="ListParagraph"/>
+        <w:numPr>
+          <w:ilvl w:val="0"/>
+          <w:numId w:val="3"/>
+        </w:numPr>
+      </w:pPr>
+      <w:r>
+        <w:t xml:space="preserve">Guide the user to the location of their replays </w:t>
+      </w:r>
+      <w:r>
+        <w:rPr>
+          <w:b/>
+          <w:bCs/>
+          <w:u w:val="single"/>
+        </w:rPr>
+        <w:t>PS3.1</w:t>
+      </w:r>
+    </w:p>
+    <w:p>
+      <w:pPr>
         <w:rPr>
           <w:b/>
           <w:bCs/>
@@ -935,6 +955,7 @@
         </w:numPr>
       </w:pPr>
       <w:r>
+        <w:lastRenderedPageBreak/>
         <w:t>Time spent ahead of the ball</w:t>
       </w:r>
       <w:r>
@@ -958,7 +979,6 @@
         </w:numPr>
       </w:pPr>
       <w:r>
-        <w:lastRenderedPageBreak/>
         <w:t>Time spent high in the air</w:t>
       </w:r>
       <w:r>
@@ -1144,10 +1164,27 @@
         </w:numPr>
       </w:pPr>
       <w:r>
-        <w:t>Compare user’s average statistics to average values similar to user’s rank (same rank, one above)</w:t>
-      </w:r>
-      <w:r>
-        <w:t xml:space="preserve"> </w:t>
+        <w:t xml:space="preserve">Compare user’s average statistics to average values similar to user’s rank </w:t>
+      </w:r>
+      <w:r>
+        <w:rPr>
+          <w:b/>
+          <w:bCs/>
+          <w:u w:val="single"/>
+        </w:rPr>
+        <w:t>I3</w:t>
+      </w:r>
+    </w:p>
+    <w:p>
+      <w:pPr>
+        <w:pStyle w:val="ListParagraph"/>
+        <w:numPr>
+          <w:ilvl w:val="0"/>
+          <w:numId w:val="6"/>
+        </w:numPr>
+      </w:pPr>
+      <w:r>
+        <w:t xml:space="preserve">Compare user’s average statistics to average values of rank of user’s choosing </w:t>
       </w:r>
       <w:r>
         <w:rPr>
@@ -1537,6 +1574,7 @@
         </w:numPr>
       </w:pPr>
       <w:r>
+        <w:lastRenderedPageBreak/>
         <w:t>Support large batch of replays</w:t>
       </w:r>
       <w:r>
@@ -1569,7 +1607,6 @@
         </w:numPr>
       </w:pPr>
       <w:r>
-        <w:lastRenderedPageBreak/>
         <w:t>Provide loading visualisation (optional: with progress)</w:t>
       </w:r>
       <w:r>

</xml_diff>

<commit_message>
finished design section 2
</commit_message>
<xml_diff>
--- a/Analysis/list of requirements.docx
+++ b/Analysis/list of requirements.docx
@@ -1780,6 +1780,69 @@
       </w:r>
       <w:r>
         <w:t>such that website remains responsive, and inform the user of any issues</w:t>
+      </w:r>
+    </w:p>
+    <w:p>
+      <w:pPr>
+        <w:rPr>
+          <w:b/>
+          <w:bCs/>
+        </w:rPr>
+      </w:pPr>
+      <w:r>
+        <w:rPr>
+          <w:b/>
+          <w:bCs/>
+        </w:rPr>
+        <w:t>2.5 Security</w:t>
+      </w:r>
+    </w:p>
+    <w:p>
+      <w:pPr>
+        <w:pStyle w:val="ListParagraph"/>
+        <w:numPr>
+          <w:ilvl w:val="0"/>
+          <w:numId w:val="12"/>
+        </w:numPr>
+        <w:rPr>
+          <w:b/>
+          <w:bCs/>
+        </w:rPr>
+      </w:pPr>
+      <w:r>
+        <w:t>Training data is anonymous</w:t>
+      </w:r>
+    </w:p>
+    <w:p>
+      <w:pPr>
+        <w:pStyle w:val="ListParagraph"/>
+        <w:numPr>
+          <w:ilvl w:val="0"/>
+          <w:numId w:val="12"/>
+        </w:numPr>
+        <w:rPr>
+          <w:b/>
+          <w:bCs/>
+        </w:rPr>
+      </w:pPr>
+      <w:r>
+        <w:t>Large dataset data is anonymous</w:t>
+      </w:r>
+    </w:p>
+    <w:p>
+      <w:pPr>
+        <w:pStyle w:val="ListParagraph"/>
+        <w:numPr>
+          <w:ilvl w:val="0"/>
+          <w:numId w:val="12"/>
+        </w:numPr>
+        <w:rPr>
+          <w:b/>
+          <w:bCs/>
+        </w:rPr>
+      </w:pPr>
+      <w:r>
+        <w:t>The user’s data is not stored, only processed</w:t>
       </w:r>
     </w:p>
     <w:sectPr>
@@ -2731,6 +2794,98 @@
       <w:rPr>
         <w:b w:val="0"/>
       </w:rPr>
+    </w:lvl>
+    <w:lvl w:ilvl="2" w:tplc="0809001B" w:tentative="1">
+      <w:start w:val="1"/>
+      <w:numFmt w:val="lowerRoman"/>
+      <w:lvlText w:val="%3."/>
+      <w:lvlJc w:val="right"/>
+      <w:pPr>
+        <w:ind w:left="2160" w:hanging="180"/>
+      </w:pPr>
+    </w:lvl>
+    <w:lvl w:ilvl="3" w:tplc="0809000F" w:tentative="1">
+      <w:start w:val="1"/>
+      <w:numFmt w:val="decimal"/>
+      <w:lvlText w:val="%4."/>
+      <w:lvlJc w:val="left"/>
+      <w:pPr>
+        <w:ind w:left="2880" w:hanging="360"/>
+      </w:pPr>
+    </w:lvl>
+    <w:lvl w:ilvl="4" w:tplc="08090019" w:tentative="1">
+      <w:start w:val="1"/>
+      <w:numFmt w:val="lowerLetter"/>
+      <w:lvlText w:val="%5."/>
+      <w:lvlJc w:val="left"/>
+      <w:pPr>
+        <w:ind w:left="3600" w:hanging="360"/>
+      </w:pPr>
+    </w:lvl>
+    <w:lvl w:ilvl="5" w:tplc="0809001B" w:tentative="1">
+      <w:start w:val="1"/>
+      <w:numFmt w:val="lowerRoman"/>
+      <w:lvlText w:val="%6."/>
+      <w:lvlJc w:val="right"/>
+      <w:pPr>
+        <w:ind w:left="4320" w:hanging="180"/>
+      </w:pPr>
+    </w:lvl>
+    <w:lvl w:ilvl="6" w:tplc="0809000F" w:tentative="1">
+      <w:start w:val="1"/>
+      <w:numFmt w:val="decimal"/>
+      <w:lvlText w:val="%7."/>
+      <w:lvlJc w:val="left"/>
+      <w:pPr>
+        <w:ind w:left="5040" w:hanging="360"/>
+      </w:pPr>
+    </w:lvl>
+    <w:lvl w:ilvl="7" w:tplc="08090019" w:tentative="1">
+      <w:start w:val="1"/>
+      <w:numFmt w:val="lowerLetter"/>
+      <w:lvlText w:val="%8."/>
+      <w:lvlJc w:val="left"/>
+      <w:pPr>
+        <w:ind w:left="5760" w:hanging="360"/>
+      </w:pPr>
+    </w:lvl>
+    <w:lvl w:ilvl="8" w:tplc="0809001B" w:tentative="1">
+      <w:start w:val="1"/>
+      <w:numFmt w:val="lowerRoman"/>
+      <w:lvlText w:val="%9."/>
+      <w:lvlJc w:val="right"/>
+      <w:pPr>
+        <w:ind w:left="6480" w:hanging="180"/>
+      </w:pPr>
+    </w:lvl>
+  </w:abstractNum>
+  <w:abstractNum w:abstractNumId="11" w15:restartNumberingAfterBreak="0">
+    <w:nsid w:val="7BC86BEA"/>
+    <w:multiLevelType w:val="hybridMultilevel"/>
+    <w:tmpl w:val="CF3CC82E"/>
+    <w:lvl w:ilvl="0" w:tplc="1B3E69C2">
+      <w:start w:val="1"/>
+      <w:numFmt w:val="decimal"/>
+      <w:suff w:val="space"/>
+      <w:lvlText w:val="2.5.%1"/>
+      <w:lvlJc w:val="left"/>
+      <w:pPr>
+        <w:ind w:left="720" w:hanging="360"/>
+      </w:pPr>
+      <w:rPr>
+        <w:rFonts w:hint="default"/>
+        <w:b/>
+        <w:i w:val="0"/>
+      </w:rPr>
+    </w:lvl>
+    <w:lvl w:ilvl="1" w:tplc="08090019" w:tentative="1">
+      <w:start w:val="1"/>
+      <w:numFmt w:val="lowerLetter"/>
+      <w:lvlText w:val="%2."/>
+      <w:lvlJc w:val="left"/>
+      <w:pPr>
+        <w:ind w:left="1440" w:hanging="360"/>
+      </w:pPr>
     </w:lvl>
     <w:lvl w:ilvl="2" w:tplc="0809001B" w:tentative="1">
       <w:start w:val="1"/>
@@ -2828,6 +2983,9 @@
   </w:num>
   <w:num w:numId="11" w16cid:durableId="92363046">
     <w:abstractNumId w:val="5"/>
+  </w:num>
+  <w:num w:numId="12" w16cid:durableId="1026826838">
+    <w:abstractNumId w:val="11"/>
   </w:num>
 </w:numbering>
 </file>
@@ -3435,7 +3593,6 @@
   <w:style w:type="character" w:default="1" w:styleId="DefaultParagraphFont">
     <w:name w:val="Default Paragraph Font"/>
     <w:uiPriority w:val="1"/>
-    <w:semiHidden/>
     <w:unhideWhenUsed/>
   </w:style>
   <w:style w:type="table" w:default="1" w:styleId="TableNormal">

</xml_diff>

<commit_message>
began making example charts
</commit_message>
<xml_diff>
--- a/Analysis/list of requirements.docx
+++ b/Analysis/list of requirements.docx
@@ -256,7 +256,10 @@
         </w:numPr>
       </w:pPr>
       <w:r>
-        <w:t>Parse replay files using Carball</w:t>
+        <w:t xml:space="preserve">Parse replay files using </w:t>
+      </w:r>
+      <w:r>
+        <w:t>an appropriate library</w:t>
       </w:r>
     </w:p>
     <w:p>
@@ -578,7 +581,13 @@
         <w:t>Visualise the AVERAGE of the statistics across the replays</w:t>
       </w:r>
       <w:r>
-        <w:t xml:space="preserve"> using bar charts </w:t>
+        <w:t xml:space="preserve"> using </w:t>
+      </w:r>
+      <w:r>
+        <w:t>suitable charts</w:t>
+      </w:r>
+      <w:r>
+        <w:t xml:space="preserve"> </w:t>
       </w:r>
       <w:r>
         <w:rPr>
@@ -626,7 +635,13 @@
         </w:rPr>
       </w:pPr>
       <w:r>
-        <w:t xml:space="preserve">Provide a section that compares certain statistics with games that were won and lost </w:t>
+        <w:t xml:space="preserve">Provide a </w:t>
+      </w:r>
+      <w:r>
+        <w:t>way to compare</w:t>
+      </w:r>
+      <w:r>
+        <w:t xml:space="preserve"> certain statistics with games that were won and lost </w:t>
       </w:r>
       <w:r>
         <w:rPr>
@@ -697,6 +712,9 @@
           <w:u w:val="single"/>
         </w:rPr>
         <w:t>.1</w:t>
+      </w:r>
+      <w:r>
+        <w:t xml:space="preserve"> </w:t>
       </w:r>
     </w:p>
     <w:p>
@@ -1142,6 +1160,18 @@
     </w:p>
     <w:p>
       <w:pPr>
+        <w:pStyle w:val="ListParagraph"/>
+        <w:numPr>
+          <w:ilvl w:val="0"/>
+          <w:numId w:val="5"/>
+        </w:numPr>
+      </w:pPr>
+      <w:r>
+        <w:t>Use model sureness to show similarity to other playstyles</w:t>
+      </w:r>
+    </w:p>
+    <w:p>
+      <w:pPr>
         <w:rPr>
           <w:b/>
           <w:bCs/>
@@ -1322,10 +1352,26 @@
         <w:t xml:space="preserve"> to handle </w:t>
       </w:r>
       <w:r>
-        <w:t xml:space="preserve">machine learning, data analysis, </w:t>
-      </w:r>
-      <w:r>
-        <w:t>data visualisation, and API calls</w:t>
+        <w:t>machine learning, data analysis</w:t>
+      </w:r>
+      <w:r>
+        <w:t>, and API calls</w:t>
+      </w:r>
+    </w:p>
+    <w:p>
+      <w:pPr>
+        <w:pStyle w:val="ListParagraph"/>
+        <w:numPr>
+          <w:ilvl w:val="0"/>
+          <w:numId w:val="7"/>
+        </w:numPr>
+        <w:rPr>
+          <w:b/>
+          <w:bCs/>
+        </w:rPr>
+      </w:pPr>
+      <w:r>
+        <w:t>Frontend has suitable chart library</w:t>
       </w:r>
     </w:p>
     <w:p>
@@ -1648,7 +1694,13 @@
         </w:numPr>
       </w:pPr>
       <w:r>
-        <w:t xml:space="preserve">(optional) cache charts for faster </w:t>
+        <w:t xml:space="preserve">(optional) </w:t>
+      </w:r>
+      <w:r>
+        <w:t>C</w:t>
+      </w:r>
+      <w:r>
+        <w:t xml:space="preserve">ache charts for faster </w:t>
       </w:r>
       <w:r>
         <w:t>re-</w:t>
@@ -1659,6 +1711,18 @@
     </w:p>
     <w:p>
       <w:pPr>
+        <w:pStyle w:val="ListParagraph"/>
+        <w:numPr>
+          <w:ilvl w:val="0"/>
+          <w:numId w:val="9"/>
+        </w:numPr>
+      </w:pPr>
+      <w:r>
+        <w:t>Only load section when first expanded to avoid longer initial waiting time</w:t>
+      </w:r>
+    </w:p>
+    <w:p>
+      <w:pPr>
         <w:rPr>
           <w:b/>
           <w:bCs/>
@@ -1804,6 +1868,69 @@
       </w:r>
       <w:r>
         <w:t>such that website remains responsive, and inform the user of any issues</w:t>
+      </w:r>
+    </w:p>
+    <w:p>
+      <w:pPr>
+        <w:rPr>
+          <w:b/>
+          <w:bCs/>
+        </w:rPr>
+      </w:pPr>
+      <w:r>
+        <w:rPr>
+          <w:b/>
+          <w:bCs/>
+        </w:rPr>
+        <w:t>2.5 Security</w:t>
+      </w:r>
+    </w:p>
+    <w:p>
+      <w:pPr>
+        <w:pStyle w:val="ListParagraph"/>
+        <w:numPr>
+          <w:ilvl w:val="0"/>
+          <w:numId w:val="14"/>
+        </w:numPr>
+        <w:rPr>
+          <w:b/>
+          <w:bCs/>
+        </w:rPr>
+      </w:pPr>
+      <w:r>
+        <w:t>Training data must be anonymous</w:t>
+      </w:r>
+    </w:p>
+    <w:p>
+      <w:pPr>
+        <w:pStyle w:val="ListParagraph"/>
+        <w:numPr>
+          <w:ilvl w:val="0"/>
+          <w:numId w:val="14"/>
+        </w:numPr>
+        <w:rPr>
+          <w:b/>
+          <w:bCs/>
+        </w:rPr>
+      </w:pPr>
+      <w:r>
+        <w:t>Large dataset data must be anonymous</w:t>
+      </w:r>
+    </w:p>
+    <w:p>
+      <w:pPr>
+        <w:pStyle w:val="ListParagraph"/>
+        <w:numPr>
+          <w:ilvl w:val="0"/>
+          <w:numId w:val="14"/>
+        </w:numPr>
+        <w:rPr>
+          <w:b/>
+          <w:bCs/>
+        </w:rPr>
+      </w:pPr>
+      <w:r>
+        <w:t>User data should not be stored, only processed</w:t>
       </w:r>
     </w:p>
     <w:sectPr>
@@ -2004,6 +2131,92 @@
     </w:lvl>
   </w:abstractNum>
   <w:abstractNum w:abstractNumId="2" w15:restartNumberingAfterBreak="0">
+    <w:nsid w:val="089D2470"/>
+    <w:multiLevelType w:val="hybridMultilevel"/>
+    <w:tmpl w:val="508C701E"/>
+    <w:lvl w:ilvl="0" w:tplc="0809000F">
+      <w:start w:val="1"/>
+      <w:numFmt w:val="decimal"/>
+      <w:lvlText w:val="%1."/>
+      <w:lvlJc w:val="left"/>
+      <w:pPr>
+        <w:ind w:left="720" w:hanging="360"/>
+      </w:pPr>
+    </w:lvl>
+    <w:lvl w:ilvl="1" w:tplc="08090019" w:tentative="1">
+      <w:start w:val="1"/>
+      <w:numFmt w:val="lowerLetter"/>
+      <w:lvlText w:val="%2."/>
+      <w:lvlJc w:val="left"/>
+      <w:pPr>
+        <w:ind w:left="1440" w:hanging="360"/>
+      </w:pPr>
+    </w:lvl>
+    <w:lvl w:ilvl="2" w:tplc="0809001B" w:tentative="1">
+      <w:start w:val="1"/>
+      <w:numFmt w:val="lowerRoman"/>
+      <w:lvlText w:val="%3."/>
+      <w:lvlJc w:val="right"/>
+      <w:pPr>
+        <w:ind w:left="2160" w:hanging="180"/>
+      </w:pPr>
+    </w:lvl>
+    <w:lvl w:ilvl="3" w:tplc="0809000F" w:tentative="1">
+      <w:start w:val="1"/>
+      <w:numFmt w:val="decimal"/>
+      <w:lvlText w:val="%4."/>
+      <w:lvlJc w:val="left"/>
+      <w:pPr>
+        <w:ind w:left="2880" w:hanging="360"/>
+      </w:pPr>
+    </w:lvl>
+    <w:lvl w:ilvl="4" w:tplc="08090019" w:tentative="1">
+      <w:start w:val="1"/>
+      <w:numFmt w:val="lowerLetter"/>
+      <w:lvlText w:val="%5."/>
+      <w:lvlJc w:val="left"/>
+      <w:pPr>
+        <w:ind w:left="3600" w:hanging="360"/>
+      </w:pPr>
+    </w:lvl>
+    <w:lvl w:ilvl="5" w:tplc="0809001B" w:tentative="1">
+      <w:start w:val="1"/>
+      <w:numFmt w:val="lowerRoman"/>
+      <w:lvlText w:val="%6."/>
+      <w:lvlJc w:val="right"/>
+      <w:pPr>
+        <w:ind w:left="4320" w:hanging="180"/>
+      </w:pPr>
+    </w:lvl>
+    <w:lvl w:ilvl="6" w:tplc="0809000F" w:tentative="1">
+      <w:start w:val="1"/>
+      <w:numFmt w:val="decimal"/>
+      <w:lvlText w:val="%7."/>
+      <w:lvlJc w:val="left"/>
+      <w:pPr>
+        <w:ind w:left="5040" w:hanging="360"/>
+      </w:pPr>
+    </w:lvl>
+    <w:lvl w:ilvl="7" w:tplc="08090019" w:tentative="1">
+      <w:start w:val="1"/>
+      <w:numFmt w:val="lowerLetter"/>
+      <w:lvlText w:val="%8."/>
+      <w:lvlJc w:val="left"/>
+      <w:pPr>
+        <w:ind w:left="5760" w:hanging="360"/>
+      </w:pPr>
+    </w:lvl>
+    <w:lvl w:ilvl="8" w:tplc="0809001B" w:tentative="1">
+      <w:start w:val="1"/>
+      <w:numFmt w:val="lowerRoman"/>
+      <w:lvlText w:val="%9."/>
+      <w:lvlJc w:val="right"/>
+      <w:pPr>
+        <w:ind w:left="6480" w:hanging="180"/>
+      </w:pPr>
+    </w:lvl>
+  </w:abstractNum>
+  <w:abstractNum w:abstractNumId="3" w15:restartNumberingAfterBreak="0">
     <w:nsid w:val="1E0A0D9E"/>
     <w:multiLevelType w:val="hybridMultilevel"/>
     <w:tmpl w:val="12A81C26"/>
@@ -2095,7 +2308,7 @@
       </w:pPr>
     </w:lvl>
   </w:abstractNum>
-  <w:abstractNum w:abstractNumId="3" w15:restartNumberingAfterBreak="0">
+  <w:abstractNum w:abstractNumId="4" w15:restartNumberingAfterBreak="0">
     <w:nsid w:val="258B7382"/>
     <w:multiLevelType w:val="hybridMultilevel"/>
     <w:tmpl w:val="43543B00"/>
@@ -2181,7 +2394,97 @@
       </w:pPr>
     </w:lvl>
   </w:abstractNum>
-  <w:abstractNum w:abstractNumId="4" w15:restartNumberingAfterBreak="0">
+  <w:abstractNum w:abstractNumId="5" w15:restartNumberingAfterBreak="0">
+    <w:nsid w:val="35B80967"/>
+    <w:multiLevelType w:val="hybridMultilevel"/>
+    <w:tmpl w:val="74569098"/>
+    <w:lvl w:ilvl="0" w:tplc="FB209BEE">
+      <w:start w:val="1"/>
+      <w:numFmt w:val="decimal"/>
+      <w:suff w:val="space"/>
+      <w:lvlText w:val="2.5.%1"/>
+      <w:lvlJc w:val="left"/>
+      <w:pPr>
+        <w:ind w:left="720" w:hanging="360"/>
+      </w:pPr>
+      <w:rPr>
+        <w:rFonts w:hint="default"/>
+      </w:rPr>
+    </w:lvl>
+    <w:lvl w:ilvl="1" w:tplc="08090019" w:tentative="1">
+      <w:start w:val="1"/>
+      <w:numFmt w:val="lowerLetter"/>
+      <w:lvlText w:val="%2."/>
+      <w:lvlJc w:val="left"/>
+      <w:pPr>
+        <w:ind w:left="1440" w:hanging="360"/>
+      </w:pPr>
+    </w:lvl>
+    <w:lvl w:ilvl="2" w:tplc="0809001B" w:tentative="1">
+      <w:start w:val="1"/>
+      <w:numFmt w:val="lowerRoman"/>
+      <w:lvlText w:val="%3."/>
+      <w:lvlJc w:val="right"/>
+      <w:pPr>
+        <w:ind w:left="2160" w:hanging="180"/>
+      </w:pPr>
+    </w:lvl>
+    <w:lvl w:ilvl="3" w:tplc="0809000F" w:tentative="1">
+      <w:start w:val="1"/>
+      <w:numFmt w:val="decimal"/>
+      <w:lvlText w:val="%4."/>
+      <w:lvlJc w:val="left"/>
+      <w:pPr>
+        <w:ind w:left="2880" w:hanging="360"/>
+      </w:pPr>
+    </w:lvl>
+    <w:lvl w:ilvl="4" w:tplc="08090019" w:tentative="1">
+      <w:start w:val="1"/>
+      <w:numFmt w:val="lowerLetter"/>
+      <w:lvlText w:val="%5."/>
+      <w:lvlJc w:val="left"/>
+      <w:pPr>
+        <w:ind w:left="3600" w:hanging="360"/>
+      </w:pPr>
+    </w:lvl>
+    <w:lvl w:ilvl="5" w:tplc="0809001B" w:tentative="1">
+      <w:start w:val="1"/>
+      <w:numFmt w:val="lowerRoman"/>
+      <w:lvlText w:val="%6."/>
+      <w:lvlJc w:val="right"/>
+      <w:pPr>
+        <w:ind w:left="4320" w:hanging="180"/>
+      </w:pPr>
+    </w:lvl>
+    <w:lvl w:ilvl="6" w:tplc="0809000F" w:tentative="1">
+      <w:start w:val="1"/>
+      <w:numFmt w:val="decimal"/>
+      <w:lvlText w:val="%7."/>
+      <w:lvlJc w:val="left"/>
+      <w:pPr>
+        <w:ind w:left="5040" w:hanging="360"/>
+      </w:pPr>
+    </w:lvl>
+    <w:lvl w:ilvl="7" w:tplc="08090019" w:tentative="1">
+      <w:start w:val="1"/>
+      <w:numFmt w:val="lowerLetter"/>
+      <w:lvlText w:val="%8."/>
+      <w:lvlJc w:val="left"/>
+      <w:pPr>
+        <w:ind w:left="5760" w:hanging="360"/>
+      </w:pPr>
+    </w:lvl>
+    <w:lvl w:ilvl="8" w:tplc="0809001B" w:tentative="1">
+      <w:start w:val="1"/>
+      <w:numFmt w:val="lowerRoman"/>
+      <w:lvlText w:val="%9."/>
+      <w:lvlJc w:val="right"/>
+      <w:pPr>
+        <w:ind w:left="6480" w:hanging="180"/>
+      </w:pPr>
+    </w:lvl>
+  </w:abstractNum>
+  <w:abstractNum w:abstractNumId="6" w15:restartNumberingAfterBreak="0">
     <w:nsid w:val="3D3F49CA"/>
     <w:multiLevelType w:val="hybridMultilevel"/>
     <w:tmpl w:val="10586AC4"/>
@@ -2273,7 +2576,7 @@
       </w:pPr>
     </w:lvl>
   </w:abstractNum>
-  <w:abstractNum w:abstractNumId="5" w15:restartNumberingAfterBreak="0">
+  <w:abstractNum w:abstractNumId="7" w15:restartNumberingAfterBreak="0">
     <w:nsid w:val="5E204923"/>
     <w:multiLevelType w:val="hybridMultilevel"/>
     <w:tmpl w:val="017EA516"/>
@@ -2365,7 +2668,7 @@
       </w:pPr>
     </w:lvl>
   </w:abstractNum>
-  <w:abstractNum w:abstractNumId="6" w15:restartNumberingAfterBreak="0">
+  <w:abstractNum w:abstractNumId="8" w15:restartNumberingAfterBreak="0">
     <w:nsid w:val="5E2D1D54"/>
     <w:multiLevelType w:val="hybridMultilevel"/>
     <w:tmpl w:val="4886B3E4"/>
@@ -2456,7 +2759,7 @@
       </w:pPr>
     </w:lvl>
   </w:abstractNum>
-  <w:abstractNum w:abstractNumId="7" w15:restartNumberingAfterBreak="0">
+  <w:abstractNum w:abstractNumId="9" w15:restartNumberingAfterBreak="0">
     <w:nsid w:val="633D5D18"/>
     <w:multiLevelType w:val="hybridMultilevel"/>
     <w:tmpl w:val="7CE617AA"/>
@@ -2548,7 +2851,96 @@
       </w:pPr>
     </w:lvl>
   </w:abstractNum>
-  <w:abstractNum w:abstractNumId="8" w15:restartNumberingAfterBreak="0">
+  <w:abstractNum w:abstractNumId="10" w15:restartNumberingAfterBreak="0">
+    <w:nsid w:val="63BA1235"/>
+    <w:multiLevelType w:val="hybridMultilevel"/>
+    <w:tmpl w:val="53EAB8F4"/>
+    <w:lvl w:ilvl="0" w:tplc="1F58B82E">
+      <w:start w:val="1"/>
+      <w:numFmt w:val="decimal"/>
+      <w:lvlText w:val="2.5.%1"/>
+      <w:lvlJc w:val="left"/>
+      <w:pPr>
+        <w:ind w:left="720" w:hanging="360"/>
+      </w:pPr>
+      <w:rPr>
+        <w:rFonts w:hint="default"/>
+      </w:rPr>
+    </w:lvl>
+    <w:lvl w:ilvl="1" w:tplc="08090019" w:tentative="1">
+      <w:start w:val="1"/>
+      <w:numFmt w:val="lowerLetter"/>
+      <w:lvlText w:val="%2."/>
+      <w:lvlJc w:val="left"/>
+      <w:pPr>
+        <w:ind w:left="1440" w:hanging="360"/>
+      </w:pPr>
+    </w:lvl>
+    <w:lvl w:ilvl="2" w:tplc="0809001B" w:tentative="1">
+      <w:start w:val="1"/>
+      <w:numFmt w:val="lowerRoman"/>
+      <w:lvlText w:val="%3."/>
+      <w:lvlJc w:val="right"/>
+      <w:pPr>
+        <w:ind w:left="2160" w:hanging="180"/>
+      </w:pPr>
+    </w:lvl>
+    <w:lvl w:ilvl="3" w:tplc="0809000F" w:tentative="1">
+      <w:start w:val="1"/>
+      <w:numFmt w:val="decimal"/>
+      <w:lvlText w:val="%4."/>
+      <w:lvlJc w:val="left"/>
+      <w:pPr>
+        <w:ind w:left="2880" w:hanging="360"/>
+      </w:pPr>
+    </w:lvl>
+    <w:lvl w:ilvl="4" w:tplc="08090019" w:tentative="1">
+      <w:start w:val="1"/>
+      <w:numFmt w:val="lowerLetter"/>
+      <w:lvlText w:val="%5."/>
+      <w:lvlJc w:val="left"/>
+      <w:pPr>
+        <w:ind w:left="3600" w:hanging="360"/>
+      </w:pPr>
+    </w:lvl>
+    <w:lvl w:ilvl="5" w:tplc="0809001B" w:tentative="1">
+      <w:start w:val="1"/>
+      <w:numFmt w:val="lowerRoman"/>
+      <w:lvlText w:val="%6."/>
+      <w:lvlJc w:val="right"/>
+      <w:pPr>
+        <w:ind w:left="4320" w:hanging="180"/>
+      </w:pPr>
+    </w:lvl>
+    <w:lvl w:ilvl="6" w:tplc="0809000F" w:tentative="1">
+      <w:start w:val="1"/>
+      <w:numFmt w:val="decimal"/>
+      <w:lvlText w:val="%7."/>
+      <w:lvlJc w:val="left"/>
+      <w:pPr>
+        <w:ind w:left="5040" w:hanging="360"/>
+      </w:pPr>
+    </w:lvl>
+    <w:lvl w:ilvl="7" w:tplc="08090019" w:tentative="1">
+      <w:start w:val="1"/>
+      <w:numFmt w:val="lowerLetter"/>
+      <w:lvlText w:val="%8."/>
+      <w:lvlJc w:val="left"/>
+      <w:pPr>
+        <w:ind w:left="5760" w:hanging="360"/>
+      </w:pPr>
+    </w:lvl>
+    <w:lvl w:ilvl="8" w:tplc="0809001B" w:tentative="1">
+      <w:start w:val="1"/>
+      <w:numFmt w:val="lowerRoman"/>
+      <w:lvlText w:val="%9."/>
+      <w:lvlJc w:val="right"/>
+      <w:pPr>
+        <w:ind w:left="6480" w:hanging="180"/>
+      </w:pPr>
+    </w:lvl>
+  </w:abstractNum>
+  <w:abstractNum w:abstractNumId="11" w15:restartNumberingAfterBreak="0">
     <w:nsid w:val="684D0CA4"/>
     <w:multiLevelType w:val="hybridMultilevel"/>
     <w:tmpl w:val="569C2636"/>
@@ -2634,7 +3026,7 @@
       </w:pPr>
     </w:lvl>
   </w:abstractNum>
-  <w:abstractNum w:abstractNumId="9" w15:restartNumberingAfterBreak="0">
+  <w:abstractNum w:abstractNumId="12" w15:restartNumberingAfterBreak="0">
     <w:nsid w:val="68BD68E6"/>
     <w:multiLevelType w:val="hybridMultilevel"/>
     <w:tmpl w:val="067E8672"/>
@@ -2726,7 +3118,7 @@
       </w:pPr>
     </w:lvl>
   </w:abstractNum>
-  <w:abstractNum w:abstractNumId="10" w15:restartNumberingAfterBreak="0">
+  <w:abstractNum w:abstractNumId="13" w15:restartNumberingAfterBreak="0">
     <w:nsid w:val="7A333747"/>
     <w:multiLevelType w:val="hybridMultilevel"/>
     <w:tmpl w:val="D9ECC132"/>
@@ -2821,36 +3213,45 @@
     </w:lvl>
   </w:abstractNum>
   <w:num w:numId="1" w16cid:durableId="54670335">
-    <w:abstractNumId w:val="8"/>
+    <w:abstractNumId w:val="11"/>
   </w:num>
   <w:num w:numId="2" w16cid:durableId="1704938474">
-    <w:abstractNumId w:val="3"/>
+    <w:abstractNumId w:val="4"/>
   </w:num>
   <w:num w:numId="3" w16cid:durableId="700394734">
-    <w:abstractNumId w:val="6"/>
+    <w:abstractNumId w:val="8"/>
   </w:num>
   <w:num w:numId="4" w16cid:durableId="2122072344">
     <w:abstractNumId w:val="0"/>
   </w:num>
   <w:num w:numId="5" w16cid:durableId="1362709268">
-    <w:abstractNumId w:val="10"/>
+    <w:abstractNumId w:val="13"/>
   </w:num>
   <w:num w:numId="6" w16cid:durableId="1096050048">
-    <w:abstractNumId w:val="4"/>
+    <w:abstractNumId w:val="6"/>
   </w:num>
   <w:num w:numId="7" w16cid:durableId="1296328077">
-    <w:abstractNumId w:val="2"/>
+    <w:abstractNumId w:val="3"/>
   </w:num>
   <w:num w:numId="8" w16cid:durableId="657878370">
     <w:abstractNumId w:val="1"/>
   </w:num>
   <w:num w:numId="9" w16cid:durableId="1912352903">
+    <w:abstractNumId w:val="9"/>
+  </w:num>
+  <w:num w:numId="10" w16cid:durableId="556018646">
+    <w:abstractNumId w:val="12"/>
+  </w:num>
+  <w:num w:numId="11" w16cid:durableId="92363046">
     <w:abstractNumId w:val="7"/>
   </w:num>
-  <w:num w:numId="10" w16cid:durableId="556018646">
-    <w:abstractNumId w:val="9"/>
+  <w:num w:numId="12" w16cid:durableId="1497572484">
+    <w:abstractNumId w:val="2"/>
   </w:num>
-  <w:num w:numId="11" w16cid:durableId="92363046">
+  <w:num w:numId="13" w16cid:durableId="677847734">
+    <w:abstractNumId w:val="10"/>
+  </w:num>
+  <w:num w:numId="14" w16cid:durableId="1380978092">
     <w:abstractNumId w:val="5"/>
   </w:num>
 </w:numbering>

</xml_diff>

<commit_message>
made header request, parses in bg
</commit_message>
<xml_diff>
--- a/Analysis/list of requirements.docx
+++ b/Analysis/list of requirements.docx
@@ -1636,7 +1636,13 @@
         <w:t xml:space="preserve"> without excessive loading time</w:t>
       </w:r>
       <w:r>
-        <w:t xml:space="preserve"> (average below 1 seconds per replay uploaded)</w:t>
+        <w:t xml:space="preserve"> (average below </w:t>
+      </w:r>
+      <w:r>
+        <w:t>2-3</w:t>
+      </w:r>
+      <w:r>
+        <w:t xml:space="preserve"> seconds per replay uploaded)</w:t>
       </w:r>
       <w:r>
         <w:t xml:space="preserve"> </w:t>

</xml_diff>